<commit_message>
Add process flow diagram to business analysis
V0-Chat-Id: rWeX0X2YwSc
</commit_message>
<xml_diff>
--- a/public/Is_Analizi_Kadro_Personel_Atama.docx
+++ b/public/Is_Analizi_Kadro_Personel_Atama.docx
@@ -483,6 +483,922 @@
       </w:r>
       <w:r>
         <w:t xml:space="preserve"> Mevcut prototipte parametreler, talepler ve kullanıcılar istemci tarafındaki örnek veriler/state ile çalışır. Kalıcı veri saklama, gerçek kimlik doğrulama ve sunucu tarafı rol denetimi üretim gereksinimi olarak ayrıca ele alınmalıdır.</w:t>
+      </w:r>
+    </w:p>
+    <w:p>
+      <w:pPr>
+        <w:pStyle w:val="Heading2"/>
+      </w:pPr>
+      <w:r>
+        <w:t>1.1 İş/Süreç Akış Diyagramı</w:t>
+      </w:r>
+    </w:p>
+    <w:p>
+      <w:pPr>
+        <w:keepNext/>
+        <w:spacing w:after="100"/>
+      </w:pPr>
+      <w:r>
+        <w:rPr>
+          <w:rFonts w:ascii="Arial" w:hAnsi="Arial"/>
+          <w:color w:val="526477"/>
+          <w:sz w:val="18"/>
+        </w:rPr>
+        <w:t>Aşağıdaki akış, prototipte tanımlı İK Sorumlusu, İK Müdürü ve Admin rollerine göre kadro/atama talebinin doğrulanması ve karara bağlanmasını; parametre yönetimini ise ayrı bir yönetim süreci olarak gösterir.</w:t>
+      </w:r>
+    </w:p>
+    <w:p>
+      <w:pPr>
+        <w:keepNext/>
+        <w:spacing w:before="140" w:after="100"/>
+        <w:jc w:val="left"/>
+      </w:pPr>
+      <w:r>
+        <w:rPr>
+          <w:rFonts w:ascii="Arial" w:hAnsi="Arial"/>
+          <w:b/>
+          <w:color w:val="16324F"/>
+          <w:sz w:val="20"/>
+        </w:rPr>
+        <w:t>A. Kadro ve personel atama talebi</w:t>
+      </w:r>
+    </w:p>
+    <w:tbl>
+      <w:tblPr>
+        <w:tblW w:type="auto" w:w="0"/>
+        <w:jc w:val="center"/>
+        <w:tblLayout w:type="fixed"/>
+        <w:tblLook w:firstColumn="1" w:firstRow="1" w:lastColumn="0" w:lastRow="0" w:noHBand="0" w:noVBand="1" w:val="04A0"/>
+        <w:tblBorders>
+          <w:top w:val="single" w:sz="8" w:space="0" w:color="C9D6E2"/>
+          <w:left w:val="single" w:sz="8" w:space="0" w:color="C9D6E2"/>
+          <w:bottom w:val="single" w:sz="8" w:space="0" w:color="C9D6E2"/>
+          <w:right w:val="single" w:sz="8" w:space="0" w:color="C9D6E2"/>
+          <w:insideH w:val="single" w:sz="8" w:space="0" w:color="C9D6E2"/>
+          <w:insideV w:val="single" w:sz="8" w:space="0" w:color="C9D6E2"/>
+        </w:tblBorders>
+      </w:tblPr>
+      <w:tblGrid>
+        <w:gridCol w:w="1074"/>
+        <w:gridCol w:w="1074"/>
+        <w:gridCol w:w="1074"/>
+        <w:gridCol w:w="1074"/>
+        <w:gridCol w:w="1074"/>
+        <w:gridCol w:w="1074"/>
+        <w:gridCol w:w="1074"/>
+        <w:gridCol w:w="1074"/>
+        <w:gridCol w:w="1074"/>
+      </w:tblGrid>
+      <w:tr>
+        <w:trPr>
+          <w:cantSplit/>
+        </w:trPr>
+        <w:tc>
+          <w:tcPr>
+            <w:tcW w:type="dxa" w:w="1785"/>
+            <w:shd w:fill="EAF2F8"/>
+            <w:vAlign w:val="center"/>
+            <w:tcMar>
+              <w:top w:w="120" w:type="dxa"/>
+              <w:start w:w="110" w:type="dxa"/>
+              <w:bottom w:w="120" w:type="dxa"/>
+              <w:end w:w="110" w:type="dxa"/>
+            </w:tcMar>
+          </w:tcPr>
+          <w:p>
+            <w:pPr>
+              <w:spacing w:after="60" w:line="252" w:lineRule="auto"/>
+              <w:jc w:val="center"/>
+            </w:pPr>
+            <w:r>
+              <w:rPr>
+                <w:rFonts w:ascii="Arial" w:hAnsi="Arial"/>
+                <w:b/>
+                <w:color w:val="16324F"/>
+                <w:sz w:val="16"/>
+              </w:rPr>
+              <w:t>İK SORUMLUSU</w:t>
+            </w:r>
+          </w:p>
+          <w:p>
+            <w:pPr>
+              <w:spacing w:after="0" w:line="252" w:lineRule="auto"/>
+              <w:jc w:val="center"/>
+            </w:pPr>
+            <w:r>
+              <w:rPr>
+                <w:rFonts w:ascii="Arial" w:hAnsi="Arial"/>
+                <w:color w:val="526477"/>
+                <w:sz w:val="15"/>
+              </w:rPr>
+              <w:t>Kadro oluşturma / güncelleme veya personel atama sürecini başlatır.</w:t>
+            </w:r>
+          </w:p>
+        </w:tc>
+        <w:tc>
+          <w:tcPr>
+            <w:tcW w:type="dxa" w:w="172"/>
+            <w:vAlign w:val="center"/>
+            <w:tcMar>
+              <w:top w:w="0" w:type="dxa"/>
+              <w:start w:w="0" w:type="dxa"/>
+              <w:bottom w:w="0" w:type="dxa"/>
+              <w:end w:w="0" w:type="dxa"/>
+            </w:tcMar>
+          </w:tcPr>
+          <w:p>
+            <w:pPr>
+              <w:spacing w:after="0"/>
+              <w:jc w:val="center"/>
+            </w:pPr>
+            <w:r>
+              <w:rPr>
+                <w:rFonts w:ascii="Arial" w:hAnsi="Arial"/>
+                <w:b/>
+                <w:color w:val="0F766E"/>
+                <w:sz w:val="30"/>
+              </w:rPr>
+              <w:t>→</w:t>
+            </w:r>
+          </w:p>
+        </w:tc>
+        <w:tc>
+          <w:tcPr>
+            <w:tcW w:type="dxa" w:w="1785"/>
+            <w:shd w:fill="EAF2F8"/>
+            <w:vAlign w:val="center"/>
+            <w:tcMar>
+              <w:top w:w="120" w:type="dxa"/>
+              <w:start w:w="110" w:type="dxa"/>
+              <w:bottom w:w="120" w:type="dxa"/>
+              <w:end w:w="110" w:type="dxa"/>
+            </w:tcMar>
+          </w:tcPr>
+          <w:p>
+            <w:pPr>
+              <w:spacing w:after="60" w:line="252" w:lineRule="auto"/>
+              <w:jc w:val="center"/>
+            </w:pPr>
+            <w:r>
+              <w:rPr>
+                <w:rFonts w:ascii="Arial" w:hAnsi="Arial"/>
+                <w:b/>
+                <w:color w:val="16324F"/>
+                <w:sz w:val="16"/>
+              </w:rPr>
+              <w:t>İK SORUMLUSU</w:t>
+            </w:r>
+          </w:p>
+          <w:p>
+            <w:pPr>
+              <w:spacing w:after="0" w:line="252" w:lineRule="auto"/>
+              <w:jc w:val="center"/>
+            </w:pPr>
+            <w:r>
+              <w:rPr>
+                <w:rFonts w:ascii="Arial" w:hAnsi="Arial"/>
+                <w:color w:val="526477"/>
+                <w:sz w:val="15"/>
+              </w:rPr>
+              <w:t>Formu doldurur; Ekstra Durum isteğe bağlıdır.</w:t>
+            </w:r>
+          </w:p>
+        </w:tc>
+        <w:tc>
+          <w:tcPr>
+            <w:tcW w:type="dxa" w:w="172"/>
+            <w:vAlign w:val="center"/>
+            <w:tcMar>
+              <w:top w:w="0" w:type="dxa"/>
+              <w:start w:w="0" w:type="dxa"/>
+              <w:bottom w:w="0" w:type="dxa"/>
+              <w:end w:w="0" w:type="dxa"/>
+            </w:tcMar>
+          </w:tcPr>
+          <w:p>
+            <w:pPr>
+              <w:spacing w:after="0"/>
+              <w:jc w:val="center"/>
+            </w:pPr>
+            <w:r>
+              <w:rPr>
+                <w:rFonts w:ascii="Arial" w:hAnsi="Arial"/>
+                <w:b/>
+                <w:color w:val="0F766E"/>
+                <w:sz w:val="30"/>
+              </w:rPr>
+              <w:t>→</w:t>
+            </w:r>
+          </w:p>
+        </w:tc>
+        <w:tc>
+          <w:tcPr>
+            <w:tcW w:type="dxa" w:w="1785"/>
+            <w:shd w:fill="E7F4F1"/>
+            <w:vAlign w:val="center"/>
+            <w:tcMar>
+              <w:top w:w="120" w:type="dxa"/>
+              <w:start w:w="110" w:type="dxa"/>
+              <w:bottom w:w="120" w:type="dxa"/>
+              <w:end w:w="110" w:type="dxa"/>
+            </w:tcMar>
+          </w:tcPr>
+          <w:p>
+            <w:pPr>
+              <w:spacing w:after="60" w:line="252" w:lineRule="auto"/>
+              <w:jc w:val="center"/>
+            </w:pPr>
+            <w:r>
+              <w:rPr>
+                <w:rFonts w:ascii="Arial" w:hAnsi="Arial"/>
+                <w:b/>
+                <w:color w:val="16324F"/>
+                <w:sz w:val="16"/>
+              </w:rPr>
+              <w:t>SİSTEM</w:t>
+            </w:r>
+          </w:p>
+          <w:p>
+            <w:pPr>
+              <w:spacing w:after="0" w:line="252" w:lineRule="auto"/>
+              <w:jc w:val="center"/>
+            </w:pPr>
+            <w:r>
+              <w:rPr>
+                <w:rFonts w:ascii="Arial" w:hAnsi="Arial"/>
+                <w:color w:val="526477"/>
+                <w:sz w:val="15"/>
+              </w:rPr>
+              <w:t>Rolü ve zorunlu alanları doğrular. Hata varsa kullanıcı düzeltir.</w:t>
+            </w:r>
+          </w:p>
+        </w:tc>
+        <w:tc>
+          <w:tcPr>
+            <w:tcW w:type="dxa" w:w="172"/>
+            <w:vAlign w:val="center"/>
+            <w:tcMar>
+              <w:top w:w="0" w:type="dxa"/>
+              <w:start w:w="0" w:type="dxa"/>
+              <w:bottom w:w="0" w:type="dxa"/>
+              <w:end w:w="0" w:type="dxa"/>
+            </w:tcMar>
+          </w:tcPr>
+          <w:p>
+            <w:pPr>
+              <w:spacing w:after="0"/>
+              <w:jc w:val="center"/>
+            </w:pPr>
+            <w:r>
+              <w:rPr>
+                <w:rFonts w:ascii="Arial" w:hAnsi="Arial"/>
+                <w:b/>
+                <w:color w:val="0F766E"/>
+                <w:sz w:val="30"/>
+              </w:rPr>
+              <w:t>→</w:t>
+            </w:r>
+          </w:p>
+        </w:tc>
+        <w:tc>
+          <w:tcPr>
+            <w:tcW w:type="dxa" w:w="1785"/>
+            <w:shd w:fill="EAF2F8"/>
+            <w:vAlign w:val="center"/>
+            <w:tcMar>
+              <w:top w:w="120" w:type="dxa"/>
+              <w:start w:w="110" w:type="dxa"/>
+              <w:bottom w:w="120" w:type="dxa"/>
+              <w:end w:w="110" w:type="dxa"/>
+            </w:tcMar>
+          </w:tcPr>
+          <w:p>
+            <w:pPr>
+              <w:spacing w:after="60" w:line="252" w:lineRule="auto"/>
+              <w:jc w:val="center"/>
+            </w:pPr>
+            <w:r>
+              <w:rPr>
+                <w:rFonts w:ascii="Arial" w:hAnsi="Arial"/>
+                <w:b/>
+                <w:color w:val="16324F"/>
+                <w:sz w:val="16"/>
+              </w:rPr>
+              <w:t>İK SORUMLUSU</w:t>
+            </w:r>
+          </w:p>
+          <w:p>
+            <w:pPr>
+              <w:spacing w:after="0" w:line="252" w:lineRule="auto"/>
+              <w:jc w:val="center"/>
+            </w:pPr>
+            <w:r>
+              <w:rPr>
+                <w:rFonts w:ascii="Arial" w:hAnsi="Arial"/>
+                <w:color w:val="526477"/>
+                <w:sz w:val="15"/>
+              </w:rPr>
+              <w:t>Talebi onaya gönderir; kayıt beklemeye alınır.</w:t>
+            </w:r>
+          </w:p>
+        </w:tc>
+        <w:tc>
+          <w:tcPr>
+            <w:tcW w:type="dxa" w:w="172"/>
+            <w:vAlign w:val="center"/>
+            <w:tcMar>
+              <w:top w:w="0" w:type="dxa"/>
+              <w:start w:w="0" w:type="dxa"/>
+              <w:bottom w:w="0" w:type="dxa"/>
+              <w:end w:w="0" w:type="dxa"/>
+            </w:tcMar>
+          </w:tcPr>
+          <w:p>
+            <w:pPr>
+              <w:spacing w:after="0"/>
+              <w:jc w:val="center"/>
+            </w:pPr>
+            <w:r>
+              <w:rPr>
+                <w:rFonts w:ascii="Arial" w:hAnsi="Arial"/>
+                <w:b/>
+                <w:color w:val="0F766E"/>
+                <w:sz w:val="30"/>
+              </w:rPr>
+              <w:t>→</w:t>
+            </w:r>
+          </w:p>
+        </w:tc>
+        <w:tc>
+          <w:tcPr>
+            <w:tcW w:type="dxa" w:w="1785"/>
+            <w:shd w:fill="EAF2F8"/>
+            <w:vAlign w:val="center"/>
+            <w:tcMar>
+              <w:top w:w="120" w:type="dxa"/>
+              <w:start w:w="110" w:type="dxa"/>
+              <w:bottom w:w="120" w:type="dxa"/>
+              <w:end w:w="110" w:type="dxa"/>
+            </w:tcMar>
+          </w:tcPr>
+          <w:p>
+            <w:pPr>
+              <w:spacing w:after="60" w:line="252" w:lineRule="auto"/>
+              <w:jc w:val="center"/>
+            </w:pPr>
+            <w:r>
+              <w:rPr>
+                <w:rFonts w:ascii="Arial" w:hAnsi="Arial"/>
+                <w:b/>
+                <w:color w:val="16324F"/>
+                <w:sz w:val="16"/>
+              </w:rPr>
+              <w:t>İK MÜDÜRÜ</w:t>
+            </w:r>
+          </w:p>
+          <w:p>
+            <w:pPr>
+              <w:spacing w:after="0" w:line="252" w:lineRule="auto"/>
+              <w:jc w:val="center"/>
+            </w:pPr>
+            <w:r>
+              <w:rPr>
+                <w:rFonts w:ascii="Arial" w:hAnsi="Arial"/>
+                <w:color w:val="526477"/>
+                <w:sz w:val="15"/>
+              </w:rPr>
+              <w:t>Talebi inceler ve onay / ret kararı verir.</w:t>
+            </w:r>
+          </w:p>
+        </w:tc>
+      </w:tr>
+    </w:tbl>
+    <w:p>
+      <w:pPr>
+        <w:keepNext/>
+        <w:spacing w:before="140" w:after="100"/>
+        <w:jc w:val="left"/>
+      </w:pPr>
+      <w:r>
+        <w:rPr>
+          <w:rFonts w:ascii="Arial" w:hAnsi="Arial"/>
+          <w:b/>
+          <w:color w:val="16324F"/>
+          <w:sz w:val="20"/>
+        </w:rPr>
+        <w:t>Karar sonucu</w:t>
+      </w:r>
+    </w:p>
+    <w:tbl>
+      <w:tblPr>
+        <w:tblW w:type="auto" w:w="0"/>
+        <w:jc w:val="center"/>
+        <w:tblLayout w:type="fixed"/>
+        <w:tblLook w:firstColumn="1" w:firstRow="1" w:lastColumn="0" w:lastRow="0" w:noHBand="0" w:noVBand="1" w:val="04A0"/>
+        <w:tblBorders>
+          <w:top w:val="single" w:sz="8" w:space="0" w:color="C9D6E2"/>
+          <w:left w:val="single" w:sz="8" w:space="0" w:color="C9D6E2"/>
+          <w:bottom w:val="single" w:sz="8" w:space="0" w:color="C9D6E2"/>
+          <w:right w:val="single" w:sz="8" w:space="0" w:color="C9D6E2"/>
+          <w:insideH w:val="single" w:sz="8" w:space="0" w:color="C9D6E2"/>
+          <w:insideV w:val="single" w:sz="8" w:space="0" w:color="C9D6E2"/>
+        </w:tblBorders>
+      </w:tblPr>
+      <w:tblGrid>
+        <w:gridCol w:w="4831"/>
+        <w:gridCol w:w="4831"/>
+      </w:tblGrid>
+      <w:tr>
+        <w:trPr>
+          <w:cantSplit/>
+        </w:trPr>
+        <w:tc>
+          <w:tcPr>
+            <w:tcW w:type="dxa" w:w="4809"/>
+            <w:shd w:fill="EAF5EC"/>
+            <w:vAlign w:val="center"/>
+            <w:tcMar>
+              <w:top w:w="120" w:type="dxa"/>
+              <w:start w:w="110" w:type="dxa"/>
+              <w:bottom w:w="120" w:type="dxa"/>
+              <w:end w:w="110" w:type="dxa"/>
+            </w:tcMar>
+          </w:tcPr>
+          <w:p>
+            <w:pPr>
+              <w:spacing w:after="60" w:line="252" w:lineRule="auto"/>
+              <w:jc w:val="center"/>
+            </w:pPr>
+            <w:r>
+              <w:rPr>
+                <w:rFonts w:ascii="Arial" w:hAnsi="Arial"/>
+                <w:b/>
+                <w:color w:val="28633A"/>
+                <w:sz w:val="18"/>
+              </w:rPr>
+              <w:t>ONAY</w:t>
+            </w:r>
+          </w:p>
+          <w:p>
+            <w:pPr>
+              <w:spacing w:after="0" w:line="252" w:lineRule="auto"/>
+              <w:jc w:val="center"/>
+            </w:pPr>
+            <w:r>
+              <w:rPr>
+                <w:rFonts w:ascii="Arial" w:hAnsi="Arial"/>
+                <w:color w:val="526477"/>
+                <w:sz w:val="17"/>
+              </w:rPr>
+              <w:t>Kadro / atama kaydı oluşturulur veya güncellenir. Talep sonucu ilgili kullanıcıya bildirilir.</w:t>
+            </w:r>
+          </w:p>
+        </w:tc>
+        <w:tc>
+          <w:tcPr>
+            <w:tcW w:type="dxa" w:w="4809"/>
+            <w:shd w:fill="FBECEE"/>
+            <w:vAlign w:val="center"/>
+            <w:tcMar>
+              <w:top w:w="120" w:type="dxa"/>
+              <w:start w:w="110" w:type="dxa"/>
+              <w:bottom w:w="120" w:type="dxa"/>
+              <w:end w:w="110" w:type="dxa"/>
+            </w:tcMar>
+          </w:tcPr>
+          <w:p>
+            <w:pPr>
+              <w:spacing w:after="60" w:line="252" w:lineRule="auto"/>
+              <w:jc w:val="center"/>
+            </w:pPr>
+            <w:r>
+              <w:rPr>
+                <w:rFonts w:ascii="Arial" w:hAnsi="Arial"/>
+                <w:b/>
+                <w:color w:val="9A3741"/>
+                <w:sz w:val="18"/>
+              </w:rPr>
+              <w:t>RET</w:t>
+            </w:r>
+          </w:p>
+          <w:p>
+            <w:pPr>
+              <w:spacing w:after="0" w:line="252" w:lineRule="auto"/>
+              <w:jc w:val="center"/>
+            </w:pPr>
+            <w:r>
+              <w:rPr>
+                <w:rFonts w:ascii="Arial" w:hAnsi="Arial"/>
+                <w:color w:val="526477"/>
+                <w:sz w:val="17"/>
+              </w:rPr>
+              <w:t>Talep reddedildi durumuna alınır; mevcut iş kaydı güncellenmez. Sonuç ilgili kullanıcıya bildirilir.</w:t>
+            </w:r>
+          </w:p>
+        </w:tc>
+      </w:tr>
+    </w:tbl>
+    <w:p>
+      <w:pPr>
+        <w:spacing w:before="80" w:after="140"/>
+      </w:pPr>
+      <w:r>
+        <w:rPr>
+          <w:rFonts w:ascii="Arial" w:hAnsi="Arial"/>
+          <w:b/>
+          <w:color w:val="526477"/>
+          <w:sz w:val="16"/>
+        </w:rPr>
+        <w:t xml:space="preserve">Akış notu: </w:t>
+      </w:r>
+      <w:r>
+        <w:rPr>
+          <w:rFonts w:ascii="Arial" w:hAnsi="Arial"/>
+          <w:color w:val="526477"/>
+          <w:sz w:val="16"/>
+        </w:rPr>
+        <w:t>Doğrulama hatasında talep onaya gönderilmez. Ret gerekçesinin zorunlu tutulması üretim kuralı olarak iş sahibi tarafından onaylanmalıdır.</w:t>
+      </w:r>
+    </w:p>
+    <w:p>
+      <w:pPr>
+        <w:keepNext/>
+        <w:spacing w:before="140" w:after="100"/>
+        <w:jc w:val="left"/>
+      </w:pPr>
+      <w:r>
+        <w:rPr>
+          <w:rFonts w:ascii="Arial" w:hAnsi="Arial"/>
+          <w:b/>
+          <w:color w:val="16324F"/>
+          <w:sz w:val="20"/>
+        </w:rPr>
+        <w:t>B. Sistem parametrelerini yönetme</w:t>
+      </w:r>
+    </w:p>
+    <w:tbl>
+      <w:tblPr>
+        <w:tblW w:type="auto" w:w="0"/>
+        <w:jc w:val="center"/>
+        <w:tblLayout w:type="fixed"/>
+        <w:tblLook w:firstColumn="1" w:firstRow="1" w:lastColumn="0" w:lastRow="0" w:noHBand="0" w:noVBand="1" w:val="04A0"/>
+        <w:tblBorders>
+          <w:top w:val="single" w:sz="8" w:space="0" w:color="C9D6E2"/>
+          <w:left w:val="single" w:sz="8" w:space="0" w:color="C9D6E2"/>
+          <w:bottom w:val="single" w:sz="8" w:space="0" w:color="C9D6E2"/>
+          <w:right w:val="single" w:sz="8" w:space="0" w:color="C9D6E2"/>
+          <w:insideH w:val="single" w:sz="8" w:space="0" w:color="C9D6E2"/>
+          <w:insideV w:val="single" w:sz="8" w:space="0" w:color="C9D6E2"/>
+        </w:tblBorders>
+      </w:tblPr>
+      <w:tblGrid>
+        <w:gridCol w:w="1074"/>
+        <w:gridCol w:w="1074"/>
+        <w:gridCol w:w="1074"/>
+        <w:gridCol w:w="1074"/>
+        <w:gridCol w:w="1074"/>
+        <w:gridCol w:w="1074"/>
+        <w:gridCol w:w="1074"/>
+        <w:gridCol w:w="1074"/>
+        <w:gridCol w:w="1074"/>
+      </w:tblGrid>
+      <w:tr>
+        <w:trPr>
+          <w:cantSplit/>
+        </w:trPr>
+        <w:tc>
+          <w:tcPr>
+            <w:tcW w:type="dxa" w:w="1785"/>
+            <w:shd w:fill="EAF2F8"/>
+            <w:vAlign w:val="center"/>
+            <w:tcMar>
+              <w:top w:w="120" w:type="dxa"/>
+              <w:start w:w="110" w:type="dxa"/>
+              <w:bottom w:w="120" w:type="dxa"/>
+              <w:end w:w="110" w:type="dxa"/>
+            </w:tcMar>
+          </w:tcPr>
+          <w:p>
+            <w:pPr>
+              <w:spacing w:after="60" w:line="252" w:lineRule="auto"/>
+              <w:jc w:val="center"/>
+            </w:pPr>
+            <w:r>
+              <w:rPr>
+                <w:rFonts w:ascii="Arial" w:hAnsi="Arial"/>
+                <w:b/>
+                <w:color w:val="16324F"/>
+                <w:sz w:val="16"/>
+              </w:rPr>
+              <w:t>ADMIN</w:t>
+            </w:r>
+          </w:p>
+          <w:p>
+            <w:pPr>
+              <w:spacing w:after="0" w:line="252" w:lineRule="auto"/>
+              <w:jc w:val="center"/>
+            </w:pPr>
+            <w:r>
+              <w:rPr>
+                <w:rFonts w:ascii="Arial" w:hAnsi="Arial"/>
+                <w:color w:val="526477"/>
+                <w:sz w:val="15"/>
+              </w:rPr>
+              <w:t>Sistem Parametreleri’ni açar.</w:t>
+            </w:r>
+          </w:p>
+        </w:tc>
+        <w:tc>
+          <w:tcPr>
+            <w:tcW w:type="dxa" w:w="172"/>
+            <w:vAlign w:val="center"/>
+            <w:tcMar>
+              <w:top w:w="0" w:type="dxa"/>
+              <w:start w:w="0" w:type="dxa"/>
+              <w:bottom w:w="0" w:type="dxa"/>
+              <w:end w:w="0" w:type="dxa"/>
+            </w:tcMar>
+          </w:tcPr>
+          <w:p>
+            <w:pPr>
+              <w:spacing w:after="0"/>
+              <w:jc w:val="center"/>
+            </w:pPr>
+            <w:r>
+              <w:rPr>
+                <w:rFonts w:ascii="Arial" w:hAnsi="Arial"/>
+                <w:b/>
+                <w:color w:val="0F766E"/>
+                <w:sz w:val="30"/>
+              </w:rPr>
+              <w:t>→</w:t>
+            </w:r>
+          </w:p>
+        </w:tc>
+        <w:tc>
+          <w:tcPr>
+            <w:tcW w:type="dxa" w:w="1785"/>
+            <w:shd w:fill="EAF2F8"/>
+            <w:vAlign w:val="center"/>
+            <w:tcMar>
+              <w:top w:w="120" w:type="dxa"/>
+              <w:start w:w="110" w:type="dxa"/>
+              <w:bottom w:w="120" w:type="dxa"/>
+              <w:end w:w="110" w:type="dxa"/>
+            </w:tcMar>
+          </w:tcPr>
+          <w:p>
+            <w:pPr>
+              <w:spacing w:after="60" w:line="252" w:lineRule="auto"/>
+              <w:jc w:val="center"/>
+            </w:pPr>
+            <w:r>
+              <w:rPr>
+                <w:rFonts w:ascii="Arial" w:hAnsi="Arial"/>
+                <w:b/>
+                <w:color w:val="16324F"/>
+                <w:sz w:val="16"/>
+              </w:rPr>
+              <w:t>ADMIN</w:t>
+            </w:r>
+          </w:p>
+          <w:p>
+            <w:pPr>
+              <w:spacing w:after="0" w:line="252" w:lineRule="auto"/>
+              <w:jc w:val="center"/>
+            </w:pPr>
+            <w:r>
+              <w:rPr>
+                <w:rFonts w:ascii="Arial" w:hAnsi="Arial"/>
+                <w:color w:val="526477"/>
+                <w:sz w:val="15"/>
+              </w:rPr>
+              <w:t>Birim veya form alanı tanımını seçer.</w:t>
+            </w:r>
+          </w:p>
+        </w:tc>
+        <w:tc>
+          <w:tcPr>
+            <w:tcW w:type="dxa" w:w="172"/>
+            <w:vAlign w:val="center"/>
+            <w:tcMar>
+              <w:top w:w="0" w:type="dxa"/>
+              <w:start w:w="0" w:type="dxa"/>
+              <w:bottom w:w="0" w:type="dxa"/>
+              <w:end w:w="0" w:type="dxa"/>
+            </w:tcMar>
+          </w:tcPr>
+          <w:p>
+            <w:pPr>
+              <w:spacing w:after="0"/>
+              <w:jc w:val="center"/>
+            </w:pPr>
+            <w:r>
+              <w:rPr>
+                <w:rFonts w:ascii="Arial" w:hAnsi="Arial"/>
+                <w:b/>
+                <w:color w:val="0F766E"/>
+                <w:sz w:val="30"/>
+              </w:rPr>
+              <w:t>→</w:t>
+            </w:r>
+          </w:p>
+        </w:tc>
+        <w:tc>
+          <w:tcPr>
+            <w:tcW w:type="dxa" w:w="1785"/>
+            <w:shd w:fill="E7F4F1"/>
+            <w:vAlign w:val="center"/>
+            <w:tcMar>
+              <w:top w:w="120" w:type="dxa"/>
+              <w:start w:w="110" w:type="dxa"/>
+              <w:bottom w:w="120" w:type="dxa"/>
+              <w:end w:w="110" w:type="dxa"/>
+            </w:tcMar>
+          </w:tcPr>
+          <w:p>
+            <w:pPr>
+              <w:spacing w:after="60" w:line="252" w:lineRule="auto"/>
+              <w:jc w:val="center"/>
+            </w:pPr>
+            <w:r>
+              <w:rPr>
+                <w:rFonts w:ascii="Arial" w:hAnsi="Arial"/>
+                <w:b/>
+                <w:color w:val="16324F"/>
+                <w:sz w:val="16"/>
+              </w:rPr>
+              <w:t>SİSTEM</w:t>
+            </w:r>
+          </w:p>
+          <w:p>
+            <w:pPr>
+              <w:spacing w:after="0" w:line="252" w:lineRule="auto"/>
+              <w:jc w:val="center"/>
+            </w:pPr>
+            <w:r>
+              <w:rPr>
+                <w:rFonts w:ascii="Arial" w:hAnsi="Arial"/>
+                <w:color w:val="526477"/>
+                <w:sz w:val="15"/>
+              </w:rPr>
+              <w:t>Boş / mükerrer değeri kontrol eder.</w:t>
+            </w:r>
+          </w:p>
+        </w:tc>
+        <w:tc>
+          <w:tcPr>
+            <w:tcW w:type="dxa" w:w="172"/>
+            <w:vAlign w:val="center"/>
+            <w:tcMar>
+              <w:top w:w="0" w:type="dxa"/>
+              <w:start w:w="0" w:type="dxa"/>
+              <w:bottom w:w="0" w:type="dxa"/>
+              <w:end w:w="0" w:type="dxa"/>
+            </w:tcMar>
+          </w:tcPr>
+          <w:p>
+            <w:pPr>
+              <w:spacing w:after="0"/>
+              <w:jc w:val="center"/>
+            </w:pPr>
+            <w:r>
+              <w:rPr>
+                <w:rFonts w:ascii="Arial" w:hAnsi="Arial"/>
+                <w:b/>
+                <w:color w:val="0F766E"/>
+                <w:sz w:val="30"/>
+              </w:rPr>
+              <w:t>→</w:t>
+            </w:r>
+          </w:p>
+        </w:tc>
+        <w:tc>
+          <w:tcPr>
+            <w:tcW w:type="dxa" w:w="1785"/>
+            <w:shd w:fill="EAF2F8"/>
+            <w:vAlign w:val="center"/>
+            <w:tcMar>
+              <w:top w:w="120" w:type="dxa"/>
+              <w:start w:w="110" w:type="dxa"/>
+              <w:bottom w:w="120" w:type="dxa"/>
+              <w:end w:w="110" w:type="dxa"/>
+            </w:tcMar>
+          </w:tcPr>
+          <w:p>
+            <w:pPr>
+              <w:spacing w:after="60" w:line="252" w:lineRule="auto"/>
+              <w:jc w:val="center"/>
+            </w:pPr>
+            <w:r>
+              <w:rPr>
+                <w:rFonts w:ascii="Arial" w:hAnsi="Arial"/>
+                <w:b/>
+                <w:color w:val="16324F"/>
+                <w:sz w:val="16"/>
+              </w:rPr>
+              <w:t>ADMIN</w:t>
+            </w:r>
+          </w:p>
+          <w:p>
+            <w:pPr>
+              <w:spacing w:after="0" w:line="252" w:lineRule="auto"/>
+              <w:jc w:val="center"/>
+            </w:pPr>
+            <w:r>
+              <w:rPr>
+                <w:rFonts w:ascii="Arial" w:hAnsi="Arial"/>
+                <w:color w:val="526477"/>
+                <w:sz w:val="15"/>
+              </w:rPr>
+              <w:t>Tanımı ekler veya kaldırır.</w:t>
+            </w:r>
+          </w:p>
+        </w:tc>
+        <w:tc>
+          <w:tcPr>
+            <w:tcW w:type="dxa" w:w="172"/>
+            <w:vAlign w:val="center"/>
+            <w:tcMar>
+              <w:top w:w="0" w:type="dxa"/>
+              <w:start w:w="0" w:type="dxa"/>
+              <w:bottom w:w="0" w:type="dxa"/>
+              <w:end w:w="0" w:type="dxa"/>
+            </w:tcMar>
+          </w:tcPr>
+          <w:p>
+            <w:pPr>
+              <w:spacing w:after="0"/>
+              <w:jc w:val="center"/>
+            </w:pPr>
+            <w:r>
+              <w:rPr>
+                <w:rFonts w:ascii="Arial" w:hAnsi="Arial"/>
+                <w:b/>
+                <w:color w:val="0F766E"/>
+                <w:sz w:val="30"/>
+              </w:rPr>
+              <w:t>→</w:t>
+            </w:r>
+          </w:p>
+        </w:tc>
+        <w:tc>
+          <w:tcPr>
+            <w:tcW w:type="dxa" w:w="1785"/>
+            <w:shd w:fill="E7F4F1"/>
+            <w:vAlign w:val="center"/>
+            <w:tcMar>
+              <w:top w:w="120" w:type="dxa"/>
+              <w:start w:w="110" w:type="dxa"/>
+              <w:bottom w:w="120" w:type="dxa"/>
+              <w:end w:w="110" w:type="dxa"/>
+            </w:tcMar>
+          </w:tcPr>
+          <w:p>
+            <w:pPr>
+              <w:spacing w:after="60" w:line="252" w:lineRule="auto"/>
+              <w:jc w:val="center"/>
+            </w:pPr>
+            <w:r>
+              <w:rPr>
+                <w:rFonts w:ascii="Arial" w:hAnsi="Arial"/>
+                <w:b/>
+                <w:color w:val="16324F"/>
+                <w:sz w:val="16"/>
+              </w:rPr>
+              <w:t>SİSTEM</w:t>
+            </w:r>
+          </w:p>
+          <w:p>
+            <w:pPr>
+              <w:spacing w:after="0" w:line="252" w:lineRule="auto"/>
+              <w:jc w:val="center"/>
+            </w:pPr>
+            <w:r>
+              <w:rPr>
+                <w:rFonts w:ascii="Arial" w:hAnsi="Arial"/>
+                <w:color w:val="526477"/>
+                <w:sz w:val="15"/>
+              </w:rPr>
+              <w:t>Seçenek listesini günceller; mevcut kayıtları korur.</w:t>
+            </w:r>
+          </w:p>
+        </w:tc>
+      </w:tr>
+    </w:tbl>
+    <w:p>
+      <w:pPr>
+        <w:spacing w:before="100" w:after="0"/>
+        <w:jc w:val="center"/>
+      </w:pPr>
+      <w:r>
+        <w:rPr>
+          <w:rFonts w:ascii="Arial" w:hAnsi="Arial"/>
+          <w:i/>
+          <w:color w:val="526477"/>
+          <w:sz w:val="16"/>
+        </w:rPr>
+        <w:t>Şekil 1.1. Kadro/atama onay akışı ve parametre yönetimi</w:t>
       </w:r>
     </w:p>
     <w:p>

</xml_diff>

<commit_message>
Record institutional SSO requirements
</commit_message>
<xml_diff>
--- a/public/Is_Analizi_Kadro_Personel_Atama.docx
+++ b/public/Is_Analizi_Kadro_Personel_Atama.docx
@@ -342,7 +342,7 @@
                 <w:color w:val="243B53"/>
                 <w:sz w:val="17"/>
               </w:rPr>
-              <w:t>Güncel Kadro Yönetimi prototipi, rol akışları ve erişim için UC-01 kullanıcı adı/şifre gereksinimi</w:t>
+              <w:t>Güncel Kadro Yönetimi prototipi, rol akışları ve erişim için UC-01 kurum SSO gereksinimi</w:t>
             </w:r>
           </w:p>
         </w:tc>
@@ -453,7 +453,7 @@
                 <w:color w:val="243B53"/>
                 <w:sz w:val="17"/>
               </w:rPr>
-              <w:t>Kullanıcı adı ve şifre ile giriş UC-01 olarak hedef gereksinime eklenmiştir; incelenen prototipte gerçek giriş ekranı, oturum yönetimi veya kullanıcı doğrulaması bulunmamaktadır. Prototipte rol seçimi demo amaçlı arayüz kontrolüdür; üretim kimlik doğrulaması ve sunucu tarafı yetkilendirme yerine geçmez.</w:t>
+              <w:t>Kurum SSO’su UC-01 hedef gereksinimidir. Mevcut prototipte SSO, gerçek giriş veya oturum yönetimi yoktur. Rol seçici yalnızca demo arayüzüdür; üretim kimlik doğrulaması ve sunucu tarafı yetkilendirme yerine geçmez.</w:t>
             </w:r>
           </w:p>
         </w:tc>
@@ -661,7 +661,7 @@
         <w:rPr>
           <w:i w:val="0"/>
         </w:rPr>
-        <w:t>Bu sürümde erişim için kullanıcı adı ve şifre girişi UC-01 olarak birinci sıraya alınmıştır. Bu, analiz dokümanındaki hedef davranıştır; uygulama prototipinde henüz gerçek kimlik doğrulama bulunmadığı ayrıca izlenir.</w:t>
+        <w:t>Bu sürümde kullanıcı erişimi için kurum SSO’su UC-01 olarak tanımlanmıştır. Bu hedef davranıştır; mevcut prototipte SSO, gerçek giriş veya oturum yönetimi uygulanmamıştır.</w:t>
       </w:r>
     </w:p>
     <w:tbl>
@@ -847,7 +847,7 @@
                 <w:color w:val="243B53"/>
                 <w:sz w:val="16"/>
               </w:rPr>
-              <w:t>UC-01 kullanıcı adı/şifre, güvenli oturum, aktif kullanıcı ve rol denetimi</w:t>
+              <w:t>UC-01 kurum SSO’su, güvenli oturum, aktif kullanıcı ve rol denetimi</w:t>
             </w:r>
           </w:p>
         </w:tc>
@@ -1160,7 +1160,7 @@
         <w:spacing w:after="60"/>
       </w:pPr>
       <w:r>
-        <w:t>Kullanıcı adı/şifre ile sisteme giriş gereksinimi ve rol bazlı başlangıç alanı.</w:t>
+        <w:t>Kurum SSO’su ile kimlik doğrulama, güvenli uygulama oturumu ve rol bazlı başlangıç alanı.</w:t>
       </w:r>
     </w:p>
     <w:p>
@@ -1232,7 +1232,7 @@
         <w:spacing w:after="60"/>
       </w:pPr>
       <w:r>
-        <w:t>Gerçek kullanıcı dizini, parola sıfırlama, çok faktörlü kimlik doğrulama, SSO ve hesap yaşam döngüsü tasarımı.</w:t>
+        <w:t>Kurum IdP bağlantısı, SSO protokolü ve kimlik claim eşlemesi, MFA politikası ve uygulama hesabı/rol yaşam döngüsü tasarımı.</w:t>
       </w:r>
     </w:p>
     <w:p>
@@ -1480,7 +1480,7 @@
                 <w:color w:val="243B53"/>
                 <w:sz w:val="16"/>
               </w:rPr>
-              <w:t>Kendisine tanımlı kullanıcı adı ve şifreyle kimliğini doğrulamak</w:t>
+              <w:t>Kurumsal SSO üzerinden kimliğini doğrulamak ve yetkili uygulama rolüne erişmek</w:t>
             </w:r>
           </w:p>
         </w:tc>
@@ -1508,7 +1508,7 @@
                 <w:color w:val="243B53"/>
                 <w:sz w:val="16"/>
               </w:rPr>
-              <w:t>Gerçek hesap/giriş yok; kullanıcı adı/şifre UC-01 hedef gereksinimi</w:t>
+              <w:t>Gerçek SSO/giriş yok; kurum SSO’su UC-01 hedef gereksinimi</w:t>
             </w:r>
           </w:p>
         </w:tc>
@@ -1878,7 +1878,7 @@
         <w:keepNext/>
       </w:pPr>
       <w:r>
-        <w:t>4.1 UC-01: kullanıcı adı ve şifre ile sisteme giriş</w:t>
+        <w:t>4.1 UC-01: kurum SSO’su ile sisteme giriş</w:t>
       </w:r>
     </w:p>
     <w:tbl>
@@ -2064,7 +2064,7 @@
                 <w:color w:val="243B53"/>
                 <w:sz w:val="16"/>
               </w:rPr>
-              <w:t>Giriş ekranını açar; kullanıcı adını ve şifresini girer.</w:t>
+              <w:t>Uygulamayı açar ve “Kurum hesabıyla giriş” eylemini seçer.</w:t>
             </w:r>
           </w:p>
         </w:tc>
@@ -2150,7 +2150,7 @@
                 <w:color w:val="243B53"/>
                 <w:sz w:val="16"/>
               </w:rPr>
-              <w:t>Girdileri doğrular; hesabın aktifliğini ve kimlik doğrulama sonucunu kontrol eder.</w:t>
+              <w:t>IdP’den dönen SSO yanıtını doğrular; kullanıcıyı değişmez kurum kimliğiyle eşleştirir ve uygulama erişimini/rolünü kontrol eder.</w:t>
             </w:r>
           </w:p>
         </w:tc>
@@ -2461,7 +2461,7 @@
                 <w:color w:val="243B53"/>
                 <w:sz w:val="17"/>
               </w:rPr>
-              <w:t>Bu akış analiz hedefidir. Bugünkü prototipte login ekranı yoktur; doğrudan iş masası açılır ve rol seçiciyle demo rol değiştirilebilir. Kullanıcı adı/şifre hiçbir ortamda açık metin saklanmamalı veya loglanmamalıdır.</w:t>
+              <w:t>Bu akış analiz hedefidir. Bugünkü prototipte gerçek giriş yoktur; doğrudan iş masası açılır ve rol seçiciyle demo rol değiştirilebilir. Kurum parolası uygulamaya alınmamalı; SSO kodu, tokenı ve hassas claim’ler saklanmamalı veya loglanmamalıdır.</w:t>
             </w:r>
           </w:p>
         </w:tc>
@@ -3987,7 +3987,7 @@
                 <w:color w:val="243B53"/>
                 <w:sz w:val="15"/>
               </w:rPr>
-              <w:t>Kullanıcı adı ve şifre ile giriş yap</w:t>
+              <w:t>Kurum SSO’su ile sisteme giriş yap</w:t>
             </w:r>
           </w:p>
         </w:tc>
@@ -5893,7 +5893,7 @@
         <w:keepNext/>
       </w:pPr>
       <w:r>
-        <w:t>UC-01 — Kullanıcı adı ve şifre ile giriş yap</w:t>
+        <w:t>UC-01 — Kurum SSO’su ile sisteme giriş yap</w:t>
       </w:r>
     </w:p>
     <w:tbl>
@@ -6080,7 +6080,7 @@
                 <w:color w:val="243B53"/>
                 <w:sz w:val="16"/>
               </w:rPr>
-              <w:t>Aktif bir kullanıcı hesabı ve kullanıcıya atanmış rol bulunur; parola güvenli biçimde saklanır.</w:t>
+              <w:t>Kurum IdP’si ve entegrasyon yapılandırılmıştır; kullanıcının etkin uygulama erişimi ve atanmış rolü vardır. Uygulamada yerel parola saklanmaz.</w:t>
             </w:r>
           </w:p>
         </w:tc>
@@ -6196,15 +6196,19 @@
                 <w:color w:val="243B53"/>
                 <w:sz w:val="16"/>
               </w:rPr>
-              <w:t>1. Kullanıcı giriş ekranını açar.</w:t>
+              <w:t>1. Kullanıcı uygulamada “Kurum hesabıyla giriş” eylemini seçer.</w:t>
               <w:br/>
-              <w:t>2. Kullanıcı adı ve şifresini girerek giriş isteğini gönderir.</w:t>
+              <w:t>2. Sistem, kararlaştırılan SSO protokolüyle kullanıcıyı kurum kimlik sağlayıcısına yönlendirir.</w:t>
               <w:br/>
-              <w:t>3. Sistem girdileri güvenli biçimde doğrular ve aktif hesap/rol ilişkisini denetler.</w:t>
+              <w:t>3. Kimlik sağlayıcı kullanıcıyı kendi politikalarına göre doğrular; MFA uygulanması kurum politikasına bağlıdır.</w:t>
               <w:br/>
-              <w:t>4. Sistem başarılı doğrulamada güvenli oturum açar ve role uygun iş masasına yönlendirir.</w:t>
+              <w:t>4. Kimlik sağlayıcı yanıtı uygulamaya döner; sistem imza, issuer/audience, istek korelasyonu ve zaman/geçerlilik koşullarını seçilen protokole göre doğrular.</w:t>
               <w:br/>
-              <w:t>5. Kullanıcı çıkış yaptığında oturum sona erer; oturum süresi dolduğunda yeniden giriş gerekir.</w:t>
+              <w:t>5. Sistem değişmez kurum kullanıcı kimliğini etkin uygulama hesabı ve atanmış rolle eşleştirir.</w:t>
+              <w:br/>
+              <w:t>6. Başarılı eşlemede güvenli uygulama oturumu açılır ve yetkili iş masasına yönlendirilir.</w:t>
+              <w:br/>
+              <w:t>7. Çıkışta uygulama oturumu iptal edilir; IdP’den çıkış ve oturum süreleri onaylanacak politikaya göre yürütülür.</w:t>
             </w:r>
           </w:p>
         </w:tc>
@@ -6262,7 +6266,7 @@
                 <w:color w:val="243B53"/>
                 <w:sz w:val="16"/>
               </w:rPr>
-              <w:t>Alanlar boş/geçersizse form gönderilmez. Yanlış kullanıcı adı/şifre için hesap varlığını ifşa etmeyen genel mesaj gösterilir. Pasif/engelli hesap oturum açamaz. Hız sınırı, kilitleme ve parola kurtarma politikası iş sahibi/güvenlik ekibince belirlenir.</w:t>
+              <w:t>Kullanıcı SSO’yu iptal ederse, yanıt geçersiz/süresi dolmuşsa, kimlik eşleşmezse veya uygulama rolü yoksa oturum açılmaz; hassas kimlik/hesap ayrıntısını açığa çıkarmayan hata verilir. Giriş reddedilir; rol seçiciyle üretim erişimi sağlanamaz. IdP erişimi yokken geri dönüş davranışı ayrıca kararlaştırılır.</w:t>
             </w:r>
           </w:p>
         </w:tc>
@@ -13139,7 +13143,7 @@
                 <w:color w:val="243B53"/>
                 <w:sz w:val="15"/>
               </w:rPr>
-              <w:t>Kullanıcı kullanıcı adı ve şifre ile kimliğini doğrulayarak oturum açabilmelidir.</w:t>
+              <w:t>Kullanıcı, kurum kimlik sağlayıcısı üzerinden SSO ile kimliğini doğrulayarak güvenli uygulama oturumu açabilmelidir.</w:t>
             </w:r>
           </w:p>
         </w:tc>
@@ -13523,7 +13527,7 @@
           </w:tcPr>
           <w:p>
             <w:r>
-              <w:t>UC-01 için kullanıcı adı ve parola alanlarını, giriş eylemini ve erişilebilir alan etiketlerini içeren bir giriş ekranı sunulmalıdır. Parola alanı girdiyi maskelemelidir.</w:t>
+              <w:t>UC-01, erişilebilir etiketli “Kurum hesabıyla giriş” eylemi sunmalı; kullanıcı adı/parola uygulama tarafından istenmemeli, kullanıcı kurum IdP’sine güvenli biçimde yönlendirilmelidir.</w:t>
             </w:r>
           </w:p>
         </w:tc>
@@ -14607,7 +14611,7 @@
                 <w:color w:val="243B53"/>
                 <w:sz w:val="16"/>
               </w:rPr>
-              <w:t>Sistem verisine erişim, kullanıcı adı/şifreyle kimlik doğrulama ve rol bazlı izinler sonrasında verilmelidir.</w:t>
+              <w:t>Sistem verisine erişim, kurum SSO doğrulaması ve sunucu tarafında denetlenen rol bazlı izinlerden sonra verilmelidir.</w:t>
             </w:r>
           </w:p>
         </w:tc>
@@ -15245,7 +15249,7 @@
                 <w:color w:val="243B53"/>
                 <w:sz w:val="16"/>
               </w:rPr>
-              <w:t>Parolalar açık metin saklanmamalı; güvenli parola özeti, TLS, oturum iptali ve güvenli hata mesajı kullanılmalıdır.</w:t>
+              <w:t>Kimlik bilgileri kurum IdP’sinde kalmalıdır. SSO yanıtı/tokenları güvenli biçimde doğrulanıp korunmalı; TLS, güvenli cookie, oturum iptali ve hassas ayrıntı sızdırmayan hata mesajları kullanılmalıdır.</w:t>
             </w:r>
           </w:p>
         </w:tc>
@@ -15913,7 +15917,7 @@
                 <w:color w:val="243B53"/>
                 <w:sz w:val="16"/>
               </w:rPr>
-              <w:t>UC-01: geçerli kullanıcı adı/şifre doğru rol ile oturum açar; hatalı/kapalı hesap oturum alamaz ve genel hata mesajı görür.</w:t>
+              <w:t>UC-01: geçerli kurum SSO yanıtı etkin kullanıcı ve atanmış rolle güvenli oturum açar; iptal/geçersiz yanıt, kapalı hesap veya rol eşleşmemesi erişim vermez ve güvenli hata gösterir.</w:t>
             </w:r>
           </w:p>
         </w:tc>
@@ -17353,7 +17357,7 @@
                 <w:color w:val="243B53"/>
                 <w:sz w:val="16"/>
               </w:rPr>
-              <w:t>Kimlik doğrulama, oturum ve rol denetimi sunucu tarafında güvenli yürütülmelidir.</w:t>
+              <w:t>Kurumsal SSO doğrulaması, oturum ve rol denetimi sunucu tarafında güvenli yürütülmelidir.</w:t>
             </w:r>
           </w:p>
         </w:tc>
@@ -17927,7 +17931,7 @@
                 <w:color w:val="243B53"/>
                 <w:sz w:val="16"/>
               </w:rPr>
-              <w:t>NFR-08 Parola/oturum</w:t>
+              <w:t>NFR-08 SSO/oturum</w:t>
             </w:r>
           </w:p>
         </w:tc>
@@ -17955,7 +17959,7 @@
                 <w:color w:val="243B53"/>
                 <w:sz w:val="16"/>
               </w:rPr>
-              <w:t>Parola güçlü hash ile saklanmalı; TLS, güvenli cookie ve oturum sonlandırma kullanılmalıdır.</w:t>
+              <w:t>Yerel parola saklanmamalıdır. SSO yanıtı/tokenları doğrulanmalı ve loglanmamalı; TLS, güvenli cookie ve sunucu tarafı oturum sonlandırma kullanılmalıdır.</w:t>
             </w:r>
           </w:p>
         </w:tc>
@@ -17983,7 +17987,7 @@
                 <w:color w:val="243B53"/>
                 <w:sz w:val="16"/>
               </w:rPr>
-              <w:t>Güvenlik gözden geçirme; parola asla loglanmaz</w:t>
+              <w:t>SSO güvenlik incelemesi; token/yanıt asla loglanmaz</w:t>
             </w:r>
           </w:p>
         </w:tc>
@@ -18158,7 +18162,7 @@
                 <w:color w:val="243B53"/>
                 <w:sz w:val="15"/>
               </w:rPr>
-              <w:t>Kullanıcı hesaplarını kim oluşturur, devre dışı bırakır ve rol atar?</w:t>
+              <w:t>Kurum IdP’den gelen grup/claim uygulama rollerine nasıl eşlenecek ve bu eşlemeyi kim yönetecek?</w:t>
             </w:r>
           </w:p>
         </w:tc>
@@ -18186,7 +18190,7 @@
                 <w:color w:val="243B53"/>
                 <w:sz w:val="15"/>
               </w:rPr>
-              <w:t>Admin yalnızca kullanıcı yönetimi yetkisi de onaylanırsa; hesap yaşam döngüsü süreçleştirilmelidir.</w:t>
+              <w:t>Kullanıcı kimliği ve hesap yaşam döngüsü kurum SSO/IdP tarafından yönetilir. Uygulama rol eşlemesi IdP grup/claim’leriyle yapılmalı; claim ve sorumlu ekip netleştirilmeli.</w:t>
             </w:r>
           </w:p>
         </w:tc>
@@ -18244,7 +18248,7 @@
                 <w:color w:val="243B53"/>
                 <w:sz w:val="15"/>
               </w:rPr>
-              <w:t>Kullanıcı adı kurumsal e-posta mı, sicil no mu, ayrı kullanıcı adı mı?</w:t>
+              <w:t>SSO subject/claim üzerinden aktarılan tekil kullanıcı kimliği ve uygulama hesabı nasıl eşleştirilecek?</w:t>
             </w:r>
           </w:p>
         </w:tc>
@@ -18272,7 +18276,7 @@
                 <w:color w:val="243B53"/>
                 <w:sz w:val="15"/>
               </w:rPr>
-              <w:t>Tekil ve değişmez kurum kullanıcı kimliği; iş sahibi kararı.</w:t>
+              <w:t>Değişmez kurum kullanıcı kimliği temel alınmalı; claim adı ve eşleme IdP sahibiyle netleştirilmeli.</w:t>
             </w:r>
           </w:p>
         </w:tc>
@@ -18330,7 +18334,7 @@
                 <w:color w:val="243B53"/>
                 <w:sz w:val="15"/>
               </w:rPr>
-              <w:t>Parola ilk atama, sıfırlama, karmaşıklık ve kilitleme politikası nedir?</w:t>
+              <w:t>Kurum kimlik sağlayıcısı ve kullanılacak SSO protokolü/ortamı hangisi?</w:t>
             </w:r>
           </w:p>
         </w:tc>
@@ -18358,7 +18362,7 @@
                 <w:color w:val="243B53"/>
                 <w:sz w:val="15"/>
               </w:rPr>
-              <w:t>Kurumsal güvenlik standardı; tek kullanımlık sıfırlama ve denetim kaydı.</w:t>
+              <w:t>Kurumun desteklediği IdP ve protokol (OIDC/SAML), test/üretim uçları ve teknik sahibi belirlenmeli.</w:t>
             </w:r>
           </w:p>
         </w:tc>
@@ -18416,7 +18420,7 @@
                 <w:color w:val="243B53"/>
                 <w:sz w:val="15"/>
               </w:rPr>
-              <w:t>SSO/MFA zorunlu mu?</w:t>
+              <w:t>MFA, oturum süresi ve uygulama/IdP çıkış davranışı nasıl uygulanacak?</w:t>
             </w:r>
           </w:p>
         </w:tc>
@@ -18444,7 +18448,7 @@
                 <w:color w:val="243B53"/>
                 <w:sz w:val="15"/>
               </w:rPr>
-              <w:t>Kimlik sağlayıcı stratejisiyle birlikte kararlaştırılmalı; mevcut talep yalnızca kullanıcı adı/şifre girişini belirtir.</w:t>
+              <w:t>MFA kurum IdP politikasına uymalı; uygulama oturumu, IdP çıkışı ve zaman aşımı güvenlik ekibiyle netleştirilmeli.</w:t>
             </w:r>
           </w:p>
         </w:tc>
@@ -19077,7 +19081,7 @@
                 <w:color w:val="243B53"/>
                 <w:sz w:val="15"/>
               </w:rPr>
-              <w:t>UC-01 kimlik doğrulama, güvenli oturum, çıkış, hesap yönetimi ve sunucu RBAC.</w:t>
+              <w:t>UC-01 kurum SSO entegrasyonu, güvenli oturum, çıkış, hesap/rol eşlemesi ve sunucu RBAC.</w:t>
             </w:r>
           </w:p>
         </w:tc>
@@ -19596,7 +19600,7 @@
         <w:spacing w:after="60"/>
       </w:pPr>
       <w:r>
-        <w:t>Gerçek hesap, rol, oturum, parola sıfırlama ve hesap devre dışı bırakma politikaları onaylanmalı.</w:t>
+        <w:t>Kurum IdP/protokolü, SSO kimlik eşlemesi, uygulama rol atama ve hesap kapatma süreci ile oturum/MFA politikaları onaylanmalı.</w:t>
       </w:r>
     </w:p>
     <w:p>

</xml_diff>